<commit_message>
Se agrega UC 014
No se agregó anteriormente.
</commit_message>
<xml_diff>
--- a/Descripcion-UC/Descripcion-UC014.docx
+++ b/Descripcion-UC/Descripcion-UC014.docx
@@ -97,7 +97,7 @@
               <w:rPr>
                 <w:rtl w:val="0"/>
               </w:rPr>
-              <w:t xml:space="preserve">Nombre del Use Case: Calcular comisiones y bonos</w:t>
+              <w:t xml:space="preserve">Nombre del Use Case: Generar reportes de productos</w:t>
             </w:r>
           </w:p>
           <w:p>
@@ -140,7 +140,7 @@
               <w:rPr>
                 <w:rtl w:val="0"/>
               </w:rPr>
-              <w:t xml:space="preserve">Nº de orden: UC-015</w:t>
+              <w:t xml:space="preserve">Nº de orden: UC-014</w:t>
             </w:r>
             <w:r>
               <w:rPr>
@@ -1358,7 +1358,7 @@
               <w:rPr>
                 <w:rtl w:val="0"/>
               </w:rPr>
-              <w:t xml:space="preserve">Objetivo: Liquidar los incentivos económicos de los vendedores y encargados de sucursal basándose en el rendimiento de ventas y la colocación de créditos personales en un periodo determinado.</w:t>
+              <w:t xml:space="preserve">Objetivo: Identificar los productos con mayor y menor rotación (más y menos vendidos) para la planificación de ofertas y gestión de stock.</w:t>
             </w:r>
           </w:p>
         </w:tc>
@@ -1400,55 +1400,15 @@
           <w:p>
             <w:pPr>
               <w:widowControl w:val="0"/>
-              <w:numPr>
-                <w:ilvl w:val="0"/>
-                <w:numId w:val="1"/>
-              </w:numPr>
               <w:spacing w:after="0" w:lineRule="auto"/>
-              <w:ind w:left="720" w:hanging="360"/>
-              <w:rPr>
-                <w:u w:val="none"/>
-              </w:rPr>
+              <w:ind w:left="720" w:firstLine="0"/>
+              <w:rPr/>
             </w:pPr>
             <w:r>
               <w:rPr>
                 <w:rtl w:val="0"/>
               </w:rPr>
               <w:t xml:space="preserve">- El usuario debe poseer permisos de nivel Gerencial o Administrativo.</w:t>
-            </w:r>
-          </w:p>
-          <w:p>
-            <w:pPr>
-              <w:widowControl w:val="0"/>
-              <w:numPr>
-                <w:ilvl w:val="0"/>
-                <w:numId w:val="1"/>
-              </w:numPr>
-              <w:spacing w:after="0" w:lineRule="auto"/>
-              <w:ind w:left="720" w:hanging="360"/>
-            </w:pPr>
-            <w:r>
-              <w:rPr>
-                <w:rtl w:val="0"/>
-              </w:rPr>
-              <w:t xml:space="preserve">El periodo a liquidar debe estar cerrado (generalmente fin de mes o año).</w:t>
-            </w:r>
-          </w:p>
-          <w:p>
-            <w:pPr>
-              <w:widowControl w:val="0"/>
-              <w:numPr>
-                <w:ilvl w:val="0"/>
-                <w:numId w:val="1"/>
-              </w:numPr>
-              <w:spacing w:after="0" w:lineRule="auto"/>
-              <w:ind w:left="720" w:hanging="360"/>
-            </w:pPr>
-            <w:r>
-              <w:rPr>
-                <w:rtl w:val="0"/>
-              </w:rPr>
-              <w:t xml:space="preserve">Deben existir registros de ventas y créditos aprobados vinculados a legajos de empleados.</w:t>
             </w:r>
             <w:r>
               <w:rPr>
@@ -1541,7 +1501,7 @@
               <w:rPr>
                 <w:rtl w:val="0"/>
               </w:rPr>
-              <w:t xml:space="preserve">- Se genera un informe de liquidación de bonos detallado por empleado.</w:t>
+              <w:t xml:space="preserve">- Se visualiza el ranking de productos según el criterio de ventas seleccionado.</w:t>
             </w:r>
           </w:p>
         </w:tc>
@@ -1641,7 +1601,7 @@
               <w:rPr>
                 <w:rtl w:val="0"/>
               </w:rPr>
-              <w:t xml:space="preserve">- No se realiza el cálculo por inconsistencia en los datos de ventas o falta de asociación de vendedores a las facturas.</w:t>
+              <w:t xml:space="preserve">- No se genera el reporte por falta de información.</w:t>
             </w:r>
           </w:p>
         </w:tc>
@@ -1744,7 +1704,7 @@
               <w:rPr>
                 <w:rtl w:val="0"/>
               </w:rPr>
-              <w:t xml:space="preserve">1. El UC comienza cuando el usuario selecciona "Liquidación de Comisiones y Bonos".</w:t>
+              <w:t xml:space="preserve">1. El UC comienza cuando el usuario selecciona "Reporte de Productos".</w:t>
               <w:tab/>
             </w:r>
           </w:p>
@@ -1758,7 +1718,7 @@
               <w:rPr>
                 <w:rtl w:val="0"/>
               </w:rPr>
-              <w:t xml:space="preserve">2. El sistema solicita seleccionar la Sucursal y el Periodo (Mes/Año).</w:t>
+              <w:t xml:space="preserve">2. El sistema solicita definir el criterio: "Más vendidos" o "Menos vendidos", sucursal y rango de fechas.</w:t>
               <w:tab/>
             </w:r>
           </w:p>
@@ -1772,7 +1732,7 @@
               <w:rPr>
                 <w:rtl w:val="0"/>
               </w:rPr>
-              <w:t xml:space="preserve">3. El sistema recupera el listado de empleados activos de la sucursal.</w:t>
+              <w:t xml:space="preserve">3. El sistema procesa los detalles de facturación agrupando por producto.</w:t>
               <w:tab/>
             </w:r>
           </w:p>
@@ -1786,7 +1746,7 @@
               <w:rPr>
                 <w:rtl w:val="0"/>
               </w:rPr>
-              <w:t xml:space="preserve">4. Por cada Vendedor, el sistema ejecuta la inclusión "Consultar Ventas por Vendedor".</w:t>
+              <w:t xml:space="preserve">4. El sistema ordena los resultados según el volumen de ventas (cantidad).</w:t>
               <w:tab/>
             </w:r>
           </w:p>
@@ -1800,6 +1760,8 @@
               <w:rPr>
                 <w:rtl w:val="0"/>
               </w:rPr>
+              <w:t xml:space="preserve">5. El sistema muestra el listado indicando Producto, Rubro, Cantidad vendida y Sucursal.</w:t>
+              <w:tab/>
             </w:r>
           </w:p>
           <w:p>
@@ -1824,7 +1786,7 @@
               <w:rPr>
                 <w:rtl w:val="0"/>
               </w:rPr>
-              <w:t xml:space="preserve">5. El sistema identifica los créditos personales aprobados (UC-011) asociados a cada vendedor en el periodo.</w:t>
+              <w:t xml:space="preserve">6. El sistema ofrece la opción de generar una "Promoción Sugerida" para productos menos vendidos.</w:t>
               <w:tab/>
             </w:r>
           </w:p>
@@ -1838,129 +1800,7 @@
               <w:rPr>
                 <w:rtl w:val="0"/>
               </w:rPr>
-              <w:t xml:space="preserve">6. El sistema aplica la fórmula: </w:t>
-              <w:br w:type="textWrapping"/>
-              <w:t xml:space="preserve">(Total Ventas Vendedor * 0.10) + (Suma Montos Créditos Aprobados * 0.03).</w:t>
-              <w:tab/>
-            </w:r>
-          </w:p>
-          <w:p>
-            <w:pPr>
-              <w:widowControl w:val="0"/>
-              <w:spacing w:after="0" w:line="240" w:lineRule="auto"/>
-              <w:rPr/>
-            </w:pPr>
-            <w:r>
-              <w:rPr>
-                <w:rtl w:val="0"/>
-              </w:rPr>
-              <w:t xml:space="preserve">7. Para el Encargado, el sistema ejecuta la inclusión "Consultar Ventas Totales Sucursal".</w:t>
-              <w:tab/>
-            </w:r>
-          </w:p>
-          <w:p>
-            <w:pPr>
-              <w:widowControl w:val="0"/>
-              <w:spacing w:after="0" w:line="240" w:lineRule="auto"/>
-              <w:rPr/>
-            </w:pPr>
-            <w:r>
-              <w:rPr>
-                <w:rtl w:val="0"/>
-              </w:rPr>
-              <w:t xml:space="preserve">8. El sistema aplica la fórmula para el Encargado: (Total Ventas Sucursal * 0.15).</w:t>
-              <w:tab/>
-            </w:r>
-          </w:p>
-          <w:p>
-            <w:pPr>
-              <w:widowControl w:val="0"/>
-              <w:spacing w:after="0" w:line="240" w:lineRule="auto"/>
-              <w:rPr/>
-            </w:pPr>
-            <w:r>
-              <w:rPr>
-                <w:rtl w:val="0"/>
-              </w:rPr>
-              <w:t xml:space="preserve">9. El sistema presenta el resumen de bonos en pantalla para revisión.</w:t>
-              <w:tab/>
-            </w:r>
-          </w:p>
-          <w:p>
-            <w:pPr>
-              <w:widowControl w:val="0"/>
-              <w:spacing w:after="0" w:line="240" w:lineRule="auto"/>
-              <w:rPr/>
-            </w:pPr>
-            <w:r>
-              <w:rPr>
-                <w:rtl w:val="0"/>
-              </w:rPr>
-            </w:r>
-          </w:p>
-          <w:p>
-            <w:pPr>
-              <w:widowControl w:val="0"/>
-              <w:spacing w:after="0" w:line="240" w:lineRule="auto"/>
-              <w:rPr/>
-            </w:pPr>
-            <w:r>
-              <w:rPr>
-                <w:rtl w:val="0"/>
-              </w:rPr>
-            </w:r>
-          </w:p>
-          <w:p>
-            <w:pPr>
-              <w:widowControl w:val="0"/>
-              <w:spacing w:after="0" w:line="240" w:lineRule="auto"/>
-              <w:rPr/>
-            </w:pPr>
-            <w:r>
-              <w:rPr>
-                <w:rtl w:val="0"/>
-              </w:rPr>
-            </w:r>
-          </w:p>
-          <w:p>
-            <w:pPr>
-              <w:widowControl w:val="0"/>
-              <w:spacing w:after="0" w:line="240" w:lineRule="auto"/>
-              <w:rPr/>
-            </w:pPr>
-            <w:r>
-              <w:rPr>
-                <w:rtl w:val="0"/>
-              </w:rPr>
-              <w:t xml:space="preserve">10. El usuario confirma la liquidación.</w:t>
-              <w:tab/>
-            </w:r>
-          </w:p>
-          <w:p>
-            <w:pPr>
-              <w:widowControl w:val="0"/>
-              <w:spacing w:after="0" w:line="240" w:lineRule="auto"/>
-              <w:rPr/>
-            </w:pPr>
-            <w:r>
-              <w:rPr>
-                <w:rtl w:val="0"/>
-              </w:rPr>
-              <w:t xml:space="preserve">11. El sistema genera el reporte de liquidación y actualiza el historial de bonos.</w:t>
-              <w:tab/>
-            </w:r>
-          </w:p>
-          <w:p>
-            <w:pPr>
-              <w:widowControl w:val="0"/>
-              <w:spacing w:after="0" w:line="240" w:lineRule="auto"/>
-              <w:rPr/>
-            </w:pPr>
-            <w:r>
-              <w:rPr>
-                <w:rtl w:val="0"/>
-              </w:rPr>
-              <w:t xml:space="preserve">12. Fin del UC.</w:t>
+              <w:t xml:space="preserve">7. Fin del UC.</w:t>
             </w:r>
           </w:p>
         </w:tc>
@@ -2074,7 +1914,6 @@
               <w:rPr>
                 <w:rtl w:val="0"/>
               </w:rPr>
-              <w:t xml:space="preserve">4.1 No se encuentran ventas para el vendedor.</w:t>
             </w:r>
           </w:p>
           <w:p>
@@ -2087,6 +1926,7 @@
               <w:rPr>
                 <w:rtl w:val="0"/>
               </w:rPr>
+              <w:t xml:space="preserve">5.1 El sistema detecta productos sin ventas en el periodo.</w:t>
             </w:r>
           </w:p>
           <w:p>
@@ -2099,7 +1939,7 @@
               <w:rPr>
                 <w:rtl w:val="0"/>
               </w:rPr>
-              <w:t xml:space="preserve">4.2 El sistema asigna bono $0 y continúa con el siguiente.</w:t>
+              <w:t xml:space="preserve">5.2 Se listan bajo la categoría "Baja rotación".</w:t>
             </w:r>
           </w:p>
           <w:p>
@@ -2112,153 +1952,6 @@
               <w:rPr>
                 <w:rtl w:val="0"/>
               </w:rPr>
-            </w:r>
-          </w:p>
-          <w:p>
-            <w:pPr>
-              <w:widowControl w:val="0"/>
-              <w:spacing w:after="0" w:line="240" w:lineRule="auto"/>
-              <w:rPr/>
-            </w:pPr>
-            <w:r>
-              <w:rPr>
-                <w:rtl w:val="0"/>
-              </w:rPr>
-            </w:r>
-          </w:p>
-          <w:p>
-            <w:pPr>
-              <w:widowControl w:val="0"/>
-              <w:spacing w:after="0" w:line="240" w:lineRule="auto"/>
-              <w:rPr/>
-            </w:pPr>
-            <w:r>
-              <w:rPr>
-                <w:rtl w:val="0"/>
-              </w:rPr>
-            </w:r>
-          </w:p>
-          <w:p>
-            <w:pPr>
-              <w:widowControl w:val="0"/>
-              <w:spacing w:after="0" w:line="240" w:lineRule="auto"/>
-              <w:rPr/>
-            </w:pPr>
-            <w:r>
-              <w:rPr>
-                <w:rtl w:val="0"/>
-              </w:rPr>
-            </w:r>
-          </w:p>
-          <w:p>
-            <w:pPr>
-              <w:widowControl w:val="0"/>
-              <w:spacing w:after="0" w:line="240" w:lineRule="auto"/>
-              <w:rPr/>
-            </w:pPr>
-            <w:r>
-              <w:rPr>
-                <w:rtl w:val="0"/>
-              </w:rPr>
-            </w:r>
-          </w:p>
-          <w:p>
-            <w:pPr>
-              <w:widowControl w:val="0"/>
-              <w:spacing w:after="0" w:line="240" w:lineRule="auto"/>
-              <w:rPr/>
-            </w:pPr>
-            <w:r>
-              <w:rPr>
-                <w:rtl w:val="0"/>
-              </w:rPr>
-            </w:r>
-          </w:p>
-          <w:p>
-            <w:pPr>
-              <w:widowControl w:val="0"/>
-              <w:spacing w:after="0" w:line="240" w:lineRule="auto"/>
-              <w:rPr/>
-            </w:pPr>
-            <w:r>
-              <w:rPr>
-                <w:rtl w:val="0"/>
-              </w:rPr>
-            </w:r>
-          </w:p>
-          <w:p>
-            <w:pPr>
-              <w:widowControl w:val="0"/>
-              <w:spacing w:after="0" w:line="240" w:lineRule="auto"/>
-              <w:rPr/>
-            </w:pPr>
-            <w:r>
-              <w:rPr>
-                <w:rtl w:val="0"/>
-              </w:rPr>
-            </w:r>
-          </w:p>
-          <w:p>
-            <w:pPr>
-              <w:widowControl w:val="0"/>
-              <w:spacing w:after="0" w:line="240" w:lineRule="auto"/>
-              <w:rPr/>
-            </w:pPr>
-            <w:r>
-              <w:rPr>
-                <w:rtl w:val="0"/>
-              </w:rPr>
-            </w:r>
-          </w:p>
-          <w:p>
-            <w:pPr>
-              <w:widowControl w:val="0"/>
-              <w:spacing w:after="0" w:line="240" w:lineRule="auto"/>
-              <w:rPr/>
-            </w:pPr>
-            <w:r>
-              <w:rPr>
-                <w:rtl w:val="0"/>
-              </w:rPr>
-            </w:r>
-          </w:p>
-          <w:p>
-            <w:pPr>
-              <w:widowControl w:val="0"/>
-              <w:spacing w:after="0" w:line="240" w:lineRule="auto"/>
-              <w:rPr/>
-            </w:pPr>
-            <w:r>
-              <w:rPr>
-                <w:rtl w:val="0"/>
-              </w:rPr>
-              <w:t xml:space="preserve">9.1 El administrador detecta un error de carga manual.</w:t>
-            </w:r>
-          </w:p>
-          <w:p>
-            <w:pPr>
-              <w:widowControl w:val="0"/>
-              <w:spacing w:after="0" w:line="240" w:lineRule="auto"/>
-              <w:rPr/>
-            </w:pPr>
-            <w:r>
-              <w:rPr>
-                <w:rtl w:val="0"/>
-              </w:rPr>
-              <w:t xml:space="preserve">9.2 Se permite ajustar manualmente con un motivo de auditoría.</w:t>
-            </w:r>
-          </w:p>
-          <w:p>
-            <w:pPr>
-              <w:widowControl w:val="0"/>
-              <w:spacing w:after="0" w:line="240" w:lineRule="auto"/>
-              <w:rPr/>
-            </w:pPr>
-            <w:r>
-              <w:rPr>
-                <w:rtl w:val="0"/>
-              </w:rPr>
-              <w:t xml:space="preserve">9.3 Se guarda el ajuste.</w:t>
             </w:r>
           </w:p>
         </w:tc>
@@ -2295,7 +1988,7 @@
               <w:rPr>
                 <w:rtl w:val="0"/>
               </w:rPr>
-              <w:t xml:space="preserve">Asociaciones de extensión: - Exportar a Sistema de Sueldos: Se activa si el usuario desea enviar la liquidación al módulo contable externo.</w:t>
+              <w:t xml:space="preserve">Asociaciones de extensión:  No aplica</w:t>
             </w:r>
           </w:p>
         </w:tc>
@@ -2332,7 +2025,7 @@
               <w:rPr>
                 <w:rtl w:val="0"/>
               </w:rPr>
-              <w:t xml:space="preserve">Asociaciones de inclusión:</w:t>
+              <w:t xml:space="preserve">Asociaciones de inclusión: No aplica</w:t>
             </w:r>
           </w:p>
           <w:p>
@@ -2345,33 +2038,7 @@
               <w:rPr>
                 <w:rtl w:val="0"/>
               </w:rPr>
-              <w:t xml:space="preserve"> - Consultar Ventas por Vendedor: Obligatorio para obtener la base del 10%.</w:t>
-            </w:r>
-          </w:p>
-          <w:p>
-            <w:pPr>
-              <w:widowControl w:val="0"/>
-              <w:spacing w:after="0" w:lineRule="auto"/>
-              <w:rPr/>
-            </w:pPr>
-            <w:r>
-              <w:rPr>
-                <w:rtl w:val="0"/>
-              </w:rPr>
-              <w:t xml:space="preserve">-Consultar Ventas Totales Sucursal: Obligatorio para el bono del encargado.</w:t>
-            </w:r>
-          </w:p>
-          <w:p>
-            <w:pPr>
-              <w:widowControl w:val="0"/>
-              <w:spacing w:after="0" w:lineRule="auto"/>
-              <w:rPr/>
-            </w:pPr>
-            <w:r>
-              <w:rPr>
-                <w:rtl w:val="0"/>
-              </w:rPr>
-              <w:t xml:space="preserve">-Validar Credenciales: Para asegurar que solo jerárquicos vean los sueldos de otros.</w:t>
+              <w:t xml:space="preserve"> </w:t>
             </w:r>
           </w:p>
         </w:tc>
@@ -2518,121 +2185,7 @@
 </file>
 
 <file path=word/numbering.xml><?xml version="1.0" encoding="utf-8"?>
-<w:numbering xmlns:mc="http://schemas.openxmlformats.org/markup-compatibility/2006" xmlns:o="urn:schemas-microsoft-com:office:office" xmlns:r="http://schemas.openxmlformats.org/officeDocument/2006/relationships" xmlns:m="http://schemas.openxmlformats.org/officeDocument/2006/math" xmlns:v="urn:schemas-microsoft-com:vml" xmlns:wp="http://schemas.openxmlformats.org/drawingml/2006/wordprocessingDrawing" xmlns:w10="urn:schemas-microsoft-com:office:word" xmlns:w="http://schemas.openxmlformats.org/wordprocessingml/2006/main" xmlns:wne="http://schemas.microsoft.com/office/word/2006/wordml" xmlns:sl="http://schemas.openxmlformats.org/schemaLibrary/2006/main" xmlns:a="http://schemas.openxmlformats.org/drawingml/2006/main" xmlns:pic="http://schemas.openxmlformats.org/drawingml/2006/picture" xmlns:c="http://schemas.openxmlformats.org/drawingml/2006/chart" xmlns:lc="http://schemas.openxmlformats.org/drawingml/2006/lockedCanvas" xmlns:dgm="http://schemas.openxmlformats.org/drawingml/2006/diagram" xmlns:wps="http://schemas.microsoft.com/office/word/2010/wordprocessingShape" xmlns:wpg="http://schemas.microsoft.com/office/word/2010/wordprocessingGroup" xmlns:w14="http://schemas.microsoft.com/office/word/2010/wordml" xmlns:w15="http://schemas.microsoft.com/office/word/2012/wordml" xmlns:w16="http://schemas.microsoft.com/office/word/2018/wordml" xmlns:w16cex="http://schemas.microsoft.com/office/word/2018/wordml/cex" xmlns:w16cid="http://schemas.microsoft.com/office/word/2016/wordml/cid" xmlns="http://schemas.microsoft.com/office/tasks/2019/documenttasks" xmlns:cr="http://schemas.microsoft.com/office/comments/2020/reactions">
-  <w:abstractNum w:abstractNumId="1">
-    <w:lvl w:ilvl="0">
-      <w:start w:val="1"/>
-      <w:numFmt w:val="bullet"/>
-      <w:lvlText w:val="-"/>
-      <w:lvlJc w:val="left"/>
-      <w:pPr>
-        <w:ind w:left="720" w:hanging="360"/>
-      </w:pPr>
-      <w:rPr>
-        <w:u w:val="none"/>
-      </w:rPr>
-    </w:lvl>
-    <w:lvl w:ilvl="1">
-      <w:start w:val="1"/>
-      <w:numFmt w:val="bullet"/>
-      <w:lvlText w:val="-"/>
-      <w:lvlJc w:val="left"/>
-      <w:pPr>
-        <w:ind w:left="1440" w:hanging="360"/>
-      </w:pPr>
-      <w:rPr>
-        <w:u w:val="none"/>
-      </w:rPr>
-    </w:lvl>
-    <w:lvl w:ilvl="2">
-      <w:start w:val="1"/>
-      <w:numFmt w:val="bullet"/>
-      <w:lvlText w:val="-"/>
-      <w:lvlJc w:val="left"/>
-      <w:pPr>
-        <w:ind w:left="2160" w:hanging="360"/>
-      </w:pPr>
-      <w:rPr>
-        <w:u w:val="none"/>
-      </w:rPr>
-    </w:lvl>
-    <w:lvl w:ilvl="3">
-      <w:start w:val="1"/>
-      <w:numFmt w:val="bullet"/>
-      <w:lvlText w:val="-"/>
-      <w:lvlJc w:val="left"/>
-      <w:pPr>
-        <w:ind w:left="2880" w:hanging="360"/>
-      </w:pPr>
-      <w:rPr>
-        <w:u w:val="none"/>
-      </w:rPr>
-    </w:lvl>
-    <w:lvl w:ilvl="4">
-      <w:start w:val="1"/>
-      <w:numFmt w:val="bullet"/>
-      <w:lvlText w:val="-"/>
-      <w:lvlJc w:val="left"/>
-      <w:pPr>
-        <w:ind w:left="3600" w:hanging="360"/>
-      </w:pPr>
-      <w:rPr>
-        <w:u w:val="none"/>
-      </w:rPr>
-    </w:lvl>
-    <w:lvl w:ilvl="5">
-      <w:start w:val="1"/>
-      <w:numFmt w:val="bullet"/>
-      <w:lvlText w:val="-"/>
-      <w:lvlJc w:val="left"/>
-      <w:pPr>
-        <w:ind w:left="4320" w:hanging="360"/>
-      </w:pPr>
-      <w:rPr>
-        <w:u w:val="none"/>
-      </w:rPr>
-    </w:lvl>
-    <w:lvl w:ilvl="6">
-      <w:start w:val="1"/>
-      <w:numFmt w:val="bullet"/>
-      <w:lvlText w:val="-"/>
-      <w:lvlJc w:val="left"/>
-      <w:pPr>
-        <w:ind w:left="5040" w:hanging="360"/>
-      </w:pPr>
-      <w:rPr>
-        <w:u w:val="none"/>
-      </w:rPr>
-    </w:lvl>
-    <w:lvl w:ilvl="7">
-      <w:start w:val="1"/>
-      <w:numFmt w:val="bullet"/>
-      <w:lvlText w:val="-"/>
-      <w:lvlJc w:val="left"/>
-      <w:pPr>
-        <w:ind w:left="5760" w:hanging="360"/>
-      </w:pPr>
-      <w:rPr>
-        <w:u w:val="none"/>
-      </w:rPr>
-    </w:lvl>
-    <w:lvl w:ilvl="8">
-      <w:start w:val="1"/>
-      <w:numFmt w:val="bullet"/>
-      <w:lvlText w:val="-"/>
-      <w:lvlJc w:val="left"/>
-      <w:pPr>
-        <w:ind w:left="6480" w:hanging="360"/>
-      </w:pPr>
-      <w:rPr>
-        <w:u w:val="none"/>
-      </w:rPr>
-    </w:lvl>
-  </w:abstractNum>
-  <w:num w:numId="1">
-    <w:abstractNumId w:val="1"/>
-  </w:num>
-</w:numbering>
+<w:numbering xmlns:mc="http://schemas.openxmlformats.org/markup-compatibility/2006" xmlns:o="urn:schemas-microsoft-com:office:office" xmlns:r="http://schemas.openxmlformats.org/officeDocument/2006/relationships" xmlns:m="http://schemas.openxmlformats.org/officeDocument/2006/math" xmlns:v="urn:schemas-microsoft-com:vml" xmlns:wp="http://schemas.openxmlformats.org/drawingml/2006/wordprocessingDrawing" xmlns:w10="urn:schemas-microsoft-com:office:word" xmlns:w="http://schemas.openxmlformats.org/wordprocessingml/2006/main" xmlns:wne="http://schemas.microsoft.com/office/word/2006/wordml" xmlns:sl="http://schemas.openxmlformats.org/schemaLibrary/2006/main" xmlns:a="http://schemas.openxmlformats.org/drawingml/2006/main" xmlns:pic="http://schemas.openxmlformats.org/drawingml/2006/picture" xmlns:c="http://schemas.openxmlformats.org/drawingml/2006/chart" xmlns:lc="http://schemas.openxmlformats.org/drawingml/2006/lockedCanvas" xmlns:dgm="http://schemas.openxmlformats.org/drawingml/2006/diagram" xmlns:wps="http://schemas.microsoft.com/office/word/2010/wordprocessingShape" xmlns:wpg="http://schemas.microsoft.com/office/word/2010/wordprocessingGroup" xmlns:w14="http://schemas.microsoft.com/office/word/2010/wordml" xmlns:w15="http://schemas.microsoft.com/office/word/2012/wordml" xmlns:w16="http://schemas.microsoft.com/office/word/2018/wordml" xmlns:w16cex="http://schemas.microsoft.com/office/word/2018/wordml/cex" xmlns:w16cid="http://schemas.microsoft.com/office/word/2016/wordml/cid" xmlns="http://schemas.microsoft.com/office/tasks/2019/documenttasks" xmlns:cr="http://schemas.microsoft.com/office/comments/2020/reactions"/>
 </file>
 
 <file path=word/styles.xml><?xml version="1.0" encoding="utf-8"?>

</xml_diff>